<commit_message>
Report: shrink full-page screenshots in the WESEE training report
The work-done report already had a Table of Contents, Heading 1/2 styles and
footer page numbers, but four of its seven screenshots were 6.0 in wide (full
content width) and dominated their pages. Resized every inline image to fit
(max 4.7 in wide / 5.0 in tall, aspect ratio preserved); TOC, page numbers and
heading hierarchy are unchanged.

Co-Authored-By: Claude Opus 4.8 <noreply@anthropic.com>
</commit_message>
<xml_diff>
--- a/docs/WESEE_Industrial_Training_Report.docx
+++ b/docs/WESEE_Industrial_Training_Report.docx
@@ -2231,7 +2231,7 @@
       <w:r>
         <w:drawing>
           <wp:inline xmlns:a="http://schemas.openxmlformats.org/drawingml/2006/main" xmlns:pic="http://schemas.openxmlformats.org/drawingml/2006/picture">
-            <wp:extent cx="4023360" cy="4622652"/>
+            <wp:extent cx="3979274" cy="4572000"/>
             <wp:docPr id="1" name="Picture 1"/>
             <wp:cNvGraphicFramePr>
               <a:graphicFrameLocks noChangeAspect="1"/>
@@ -2252,7 +2252,7 @@
                   <pic:spPr>
                     <a:xfrm>
                       <a:off x="0" y="0"/>
-                      <a:ext cx="4023360" cy="4622652"/>
+                      <a:ext cx="3979274" cy="4572000"/>
                     </a:xfrm>
                     <a:prstGeom prst="rect"/>
                   </pic:spPr>
@@ -3481,7 +3481,7 @@
       <w:r>
         <w:drawing>
           <wp:inline xmlns:a="http://schemas.openxmlformats.org/drawingml/2006/main" xmlns:pic="http://schemas.openxmlformats.org/drawingml/2006/picture">
-            <wp:extent cx="5486400" cy="2510583"/>
+            <wp:extent cx="4297680" cy="1966623"/>
             <wp:docPr id="2" name="Picture 2"/>
             <wp:cNvGraphicFramePr>
               <a:graphicFrameLocks noChangeAspect="1"/>
@@ -3502,7 +3502,7 @@
                   <pic:spPr>
                     <a:xfrm>
                       <a:off x="0" y="0"/>
-                      <a:ext cx="5486400" cy="2510583"/>
+                      <a:ext cx="4297680" cy="1966623"/>
                     </a:xfrm>
                     <a:prstGeom prst="rect"/>
                   </pic:spPr>
@@ -3548,7 +3548,7 @@
       <w:r>
         <w:drawing>
           <wp:inline xmlns:a="http://schemas.openxmlformats.org/drawingml/2006/main" xmlns:pic="http://schemas.openxmlformats.org/drawingml/2006/picture">
-            <wp:extent cx="4023360" cy="4622652"/>
+            <wp:extent cx="3979274" cy="4572000"/>
             <wp:docPr id="3" name="Picture 3"/>
             <wp:cNvGraphicFramePr>
               <a:graphicFrameLocks noChangeAspect="1"/>
@@ -3569,7 +3569,7 @@
                   <pic:spPr>
                     <a:xfrm>
                       <a:off x="0" y="0"/>
-                      <a:ext cx="4023360" cy="4622652"/>
+                      <a:ext cx="3979274" cy="4572000"/>
                     </a:xfrm>
                     <a:prstGeom prst="rect"/>
                   </pic:spPr>
@@ -3919,7 +3919,7 @@
       <w:r>
         <w:drawing>
           <wp:inline xmlns:a="http://schemas.openxmlformats.org/drawingml/2006/main" xmlns:pic="http://schemas.openxmlformats.org/drawingml/2006/picture">
-            <wp:extent cx="5486400" cy="3444723"/>
+            <wp:extent cx="4297680" cy="2698366"/>
             <wp:docPr id="4" name="Picture 4"/>
             <wp:cNvGraphicFramePr>
               <a:graphicFrameLocks noChangeAspect="1"/>
@@ -3940,7 +3940,7 @@
                   <pic:spPr>
                     <a:xfrm>
                       <a:off x="0" y="0"/>
-                      <a:ext cx="5486400" cy="3444723"/>
+                      <a:ext cx="4297680" cy="2698366"/>
                     </a:xfrm>
                     <a:prstGeom prst="rect"/>
                   </pic:spPr>
@@ -3984,7 +3984,7 @@
       <w:r>
         <w:drawing>
           <wp:inline xmlns:a="http://schemas.openxmlformats.org/drawingml/2006/main" xmlns:pic="http://schemas.openxmlformats.org/drawingml/2006/picture">
-            <wp:extent cx="5486400" cy="3708658"/>
+            <wp:extent cx="4297680" cy="2905115"/>
             <wp:docPr id="6" name="Picture 6"/>
             <wp:cNvGraphicFramePr>
               <a:graphicFrameLocks noChangeAspect="1"/>
@@ -4005,7 +4005,7 @@
                   <pic:spPr>
                     <a:xfrm>
                       <a:off x="0" y="0"/>
-                      <a:ext cx="5486400" cy="3708658"/>
+                      <a:ext cx="4297680" cy="2905115"/>
                     </a:xfrm>
                     <a:prstGeom prst="rect"/>
                   </pic:spPr>
@@ -4092,7 +4092,7 @@
       <w:r>
         <w:drawing>
           <wp:inline xmlns:a="http://schemas.openxmlformats.org/drawingml/2006/main" xmlns:pic="http://schemas.openxmlformats.org/drawingml/2006/picture">
-            <wp:extent cx="5486400" cy="4244641"/>
+            <wp:extent cx="4297680" cy="3324968"/>
             <wp:docPr id="5" name="Picture 5"/>
             <wp:cNvGraphicFramePr>
               <a:graphicFrameLocks noChangeAspect="1"/>
@@ -4113,7 +4113,7 @@
                   <pic:spPr>
                     <a:xfrm>
                       <a:off x="0" y="0"/>
-                      <a:ext cx="5486400" cy="4244641"/>
+                      <a:ext cx="4297680" cy="3324968"/>
                     </a:xfrm>
                     <a:prstGeom prst="rect"/>
                   </pic:spPr>
@@ -5769,7 +5769,7 @@
       <w:r>
         <w:drawing>
           <wp:inline xmlns:a="http://schemas.openxmlformats.org/drawingml/2006/main" xmlns:pic="http://schemas.openxmlformats.org/drawingml/2006/picture">
-            <wp:extent cx="5486400" cy="3124270"/>
+            <wp:extent cx="4297680" cy="2447344"/>
             <wp:docPr id="7" name="Picture 7"/>
             <wp:cNvGraphicFramePr>
               <a:graphicFrameLocks noChangeAspect="1"/>
@@ -5790,7 +5790,7 @@
                   <pic:spPr>
                     <a:xfrm>
                       <a:off x="0" y="0"/>
-                      <a:ext cx="5486400" cy="3124270"/>
+                      <a:ext cx="4297680" cy="2447344"/>
                     </a:xfrm>
                     <a:prstGeom prst="rect"/>
                   </pic:spPr>

</xml_diff>